<commit_message>
docs: sincronizar correcciones del 19/10 (ES) a la versión EN
- ES: quitada la sección "1.7 Estructura de la memoria" (redundante con
  el índice) y reescrito el párrafo de "Trabajo futuro" (§5.10) con tono
  más desarrollado — cambios hechos directamente en Word por el autor.
- EN: aplicados los mismos dos cambios (sección "1.7 Structure of the
  Report" eliminada, "5.10 Future Work" traducido manteniendo la
  terminología ya establecida en el resto del documento) más el ajuste
  menor "with the LiDAR" -> "with LiDAR" para igualar el original.
  Verificado: 362 párrafos, 10 tablas, estructura de apéndices intacta.
- Eliminados dos .docx intermedios de la corrección de Marina en
  1_Entrega_profesor/, ya obsoletos (el contenido vive en el fichero
  principal).

Co-Authored-By: Claude Sonnet 5 <noreply@anthropic.com>
</commit_message>
<xml_diff>
--- a/memoria/1_Entrega_profesor/TFM_Memoria_EN.docx
+++ b/memoria/1_Entrega_profesor/TFM_Memoria_EN.docx
@@ -5518,13 +5518,7 @@
           <w:b/>
           <w:color w:val="000000"/>
         </w:rPr>
-        <w:t>SLAM-based mapping.</w:t>
-      </w:r>
-      <w:r>
-        <w:rPr>
-          <w:color w:val="000000"/>
-        </w:rPr>
-        <w:t xml:space="preserve"> Integrating SLAM Toolbox with the LiDAR to build maps of the lab that are then reused for localization and navigation. Objective completed.</w:t>
+        <w:t>SLAM-based mapping. Integrating SLAM Toolbox with LiDAR to build maps of the lab that are then reused for localization and navigation. Objective completed.</w:t>
       </w:r>
     </w:p>
     <w:p>
@@ -7136,212 +7130,6 @@
         </w:tc>
       </w:tr>
     </w:tbl>
-    <w:p>
-      <w:pPr>
-        <w:pStyle w:val="Ttulo2"/>
-        <w:spacing w:before="240" w:after="80"/>
-      </w:pPr>
-      <w:bookmarkStart w:id="9" w:name="_Toc242947273"/>
-      <w:r>
-        <w:t>1.7 Structure of the Report</w:t>
-      </w:r>
-      <w:bookmarkEnd w:id="9"/>
-    </w:p>
-    <w:p>
-      <w:pPr>
-        <w:spacing w:after="120" w:line="276" w:lineRule="auto"/>
-        <w:jc w:val="both"/>
-      </w:pPr>
-      <w:r>
-        <w:t>The rest of the report is organized as follows:</w:t>
-      </w:r>
-    </w:p>
-    <w:p>
-      <w:pPr>
-        <w:numPr>
-          <w:ilvl w:val="0"/>
-          <w:numId w:val="1"/>
-        </w:numPr>
-        <w:pBdr>
-          <w:top w:val="nil"/>
-          <w:left w:val="nil"/>
-          <w:bottom w:val="nil"/>
-          <w:right w:val="nil"/>
-          <w:between w:val="nil"/>
-        </w:pBdr>
-        <w:spacing w:after="120" w:line="280" w:lineRule="auto"/>
-      </w:pPr>
-      <w:r>
-        <w:rPr>
-          <w:color w:val="000000"/>
-        </w:rPr>
-        <w:t>Chapter 2 — State of the Art: literature review connected to the design decisions.</w:t>
-      </w:r>
-    </w:p>
-    <w:p>
-      <w:pPr>
-        <w:numPr>
-          <w:ilvl w:val="0"/>
-          <w:numId w:val="1"/>
-        </w:numPr>
-        <w:pBdr>
-          <w:top w:val="nil"/>
-          <w:left w:val="nil"/>
-          <w:bottom w:val="nil"/>
-          <w:right w:val="nil"/>
-          <w:between w:val="nil"/>
-        </w:pBdr>
-        <w:spacing w:after="120" w:line="280" w:lineRule="auto"/>
-      </w:pPr>
-      <w:r>
-        <w:rPr>
-          <w:color w:val="000000"/>
-        </w:rPr>
-        <w:t>Chapter 3 — System Architecture: introduction to ROS 2, nodes, topics and data flow.</w:t>
-      </w:r>
-    </w:p>
-    <w:p>
-      <w:pPr>
-        <w:numPr>
-          <w:ilvl w:val="0"/>
-          <w:numId w:val="1"/>
-        </w:numPr>
-        <w:pBdr>
-          <w:top w:val="nil"/>
-          <w:left w:val="nil"/>
-          <w:bottom w:val="nil"/>
-          <w:right w:val="nil"/>
-          <w:between w:val="nil"/>
-        </w:pBdr>
-        <w:spacing w:after="120" w:line="280" w:lineRule="auto"/>
-      </w:pPr>
-      <w:r>
-        <w:rPr>
-          <w:color w:val="000000"/>
-        </w:rPr>
-        <w:t>Chapter 4 — Implementation: algorithms, control formulas, and package structure.</w:t>
-      </w:r>
-    </w:p>
-    <w:p>
-      <w:pPr>
-        <w:numPr>
-          <w:ilvl w:val="0"/>
-          <w:numId w:val="1"/>
-        </w:numPr>
-        <w:pBdr>
-          <w:top w:val="nil"/>
-          <w:left w:val="nil"/>
-          <w:bottom w:val="nil"/>
-          <w:right w:val="nil"/>
-          <w:between w:val="nil"/>
-        </w:pBdr>
-        <w:spacing w:after="120" w:line="280" w:lineRule="auto"/>
-      </w:pPr>
-      <w:r>
-        <w:rPr>
-          <w:color w:val="000000"/>
-        </w:rPr>
-        <w:t>Chapter 5 — Results and Evaluation: analysis of the experimental validation data.</w:t>
-      </w:r>
-    </w:p>
-    <w:p>
-      <w:pPr>
-        <w:numPr>
-          <w:ilvl w:val="0"/>
-          <w:numId w:val="1"/>
-        </w:numPr>
-        <w:pBdr>
-          <w:top w:val="nil"/>
-          <w:left w:val="nil"/>
-          <w:bottom w:val="nil"/>
-          <w:right w:val="nil"/>
-          <w:between w:val="nil"/>
-        </w:pBdr>
-        <w:spacing w:after="120" w:line="280" w:lineRule="auto"/>
-      </w:pPr>
-      <w:r>
-        <w:rPr>
-          <w:color w:val="000000"/>
-        </w:rPr>
-        <w:t>Chapter 6 — Conclusions: degree of fulfillment of the objectives, contributions, lessons learned and future work.</w:t>
-      </w:r>
-    </w:p>
-    <w:p>
-      <w:pPr>
-        <w:numPr>
-          <w:ilvl w:val="0"/>
-          <w:numId w:val="1"/>
-        </w:numPr>
-        <w:pBdr>
-          <w:top w:val="nil"/>
-          <w:left w:val="nil"/>
-          <w:bottom w:val="nil"/>
-          <w:right w:val="nil"/>
-          <w:between w:val="nil"/>
-        </w:pBdr>
-        <w:spacing w:after="120" w:line="280" w:lineRule="auto"/>
-      </w:pPr>
-      <w:r>
-        <w:rPr>
-          <w:color w:val="000000"/>
-        </w:rPr>
-        <w:t>Bibliography: references cited throughout the report.</w:t>
-      </w:r>
-    </w:p>
-    <w:p>
-      <w:pPr>
-        <w:numPr>
-          <w:ilvl w:val="0"/>
-          <w:numId w:val="1"/>
-        </w:numPr>
-        <w:pBdr>
-          <w:top w:val="nil"/>
-          <w:left w:val="nil"/>
-          <w:bottom w:val="nil"/>
-          <w:right w:val="nil"/>
-          <w:between w:val="nil"/>
-        </w:pBdr>
-        <w:spacing w:after="120" w:line="280" w:lineRule="auto"/>
-      </w:pPr>
-      <w:r>
-        <w:rPr>
-          <w:color w:val="000000"/>
-        </w:rPr>
-        <w:t>Appendix A — AI Tools: declaration of their use as a development aid.</w:t>
-      </w:r>
-    </w:p>
-    <w:p>
-      <w:pPr>
-        <w:numPr>
-          <w:ilvl w:val="0"/>
-          <w:numId w:val="1"/>
-        </w:numPr>
-        <w:pBdr>
-          <w:top w:val="nil"/>
-          <w:left w:val="nil"/>
-          <w:bottom w:val="nil"/>
-          <w:right w:val="nil"/>
-          <w:between w:val="nil"/>
-        </w:pBdr>
-        <w:spacing w:after="120" w:line="280" w:lineRule="auto"/>
-      </w:pPr>
-      <w:r>
-        <w:rPr>
-          <w:color w:val="000000"/>
-        </w:rPr>
-        <w:t>Appendix B — Development Diary: chronological record of technical progress.</w:t>
-      </w:r>
-    </w:p>
-    <w:p>
-      <w:pPr>
-        <w:spacing w:after="120" w:line="276" w:lineRule="auto"/>
-        <w:jc w:val="both"/>
-      </w:pPr>
-      <w:r>
-        <w:lastRenderedPageBreak/>
-        <w:t>The system's source code, configuration files and validation scripts are available in the project's public repository, https://github.com/juanitomuro1999/TFM_JUAN (Muñoz Rovira, 2026).</w:t>
-      </w:r>
-    </w:p>
     <w:p>
       <w:pPr>
         <w:pStyle w:val="Ttulo1"/>
@@ -15660,7 +15448,7 @@
         <w:jc w:val="both"/>
       </w:pPr>
       <w:r>
-        <w:t>Several lines of work remain outside the scope of this thesis: guidance to several destinations, with one gesture or QR code per destination, which would complete objective 5; an exit maneuver for when localization leaves the robot next to an obstacle, before requesting the route from Nav2; repeating the stop and occlusion tests with more samples; and evaluating the system with more people, environments and lighting conditions. To these are added two improvements already identified during development: incorporating the Orbbec Astra RGB-D camera, or a second LiDAR, to detect obstacles outside the scan plane (Section 5.6), and connecting the collision_handling_node signal to control_node (Section 3.3.5).</w:t>
+        <w:t>Following the work carried out, several further lines of work are proposed, beyond the scope of this thesis. One proposal would be guidance to several destinations, with one gesture or QR code per destination (preferable), which would complete objective 5. Another possibility would be building an exit maneuver for when localization leaves the robot next to an obstacle, before requesting the new route from Nav2. Also proposed are repeating the stop and occlusion tests with more samples, and evaluating the system with more people, environments and lighting conditions. Two further improvements already identified during development are added to these: incorporating the Orbbec Astra RGB-D camera, or a second LiDAR, to detect obstacles outside the scan plane (Section 5.6), and connecting the collision_handling_node signal to control_node (Section 3.3.5).</w:t>
       </w:r>
     </w:p>
     <w:p>

</xml_diff>